<commit_message>
Fix SOP section 2.4: Bulk Project Actions, not creation
Corrects the Bulk Project section to accurately describe the actual
feature: transfer ownership, change status, and archive/delete projects
in bulk — not bulk project creation.

Co-Authored-By: Claude Opus 4.6 <noreply@anthropic.com>
Claude-Session: https://claude.ai/code/session_01NmtRw5o45Gj7NnjJo2UuGw
</commit_message>
<xml_diff>
--- a/SymplPM-SOP.docx
+++ b/SymplPM-SOP.docx
@@ -1622,21 +1622,97 @@
           <w:bCs/>
           <w:color w:val="1F2937"/>
         </w:rPr>
-        <w:t xml:space="preserve">2.4 Bulk Project Creation</w:t>
-      </w:r>
-    </w:p>
-    <w:p>
-      <w:pPr>
-        <w:spacing w:after="120"/>
-      </w:pPr>
-      <w:r>
-        <w:rPr>
-          <w:rFonts w:ascii="Calibri" w:cs="Calibri" w:eastAsia="Calibri" w:hAnsi="Calibri"/>
-          <w:color w:val="1F2937"/>
-          <w:sz w:val="22"/>
-          <w:szCs w:val="22"/>
-        </w:rPr>
-        <w:t xml:space="preserve">Admin &gt; Bulk Projects allows administrators to create multiple projects from a spreadsheet template in a single operation.</w:t>
+        <w:t xml:space="preserve">2.4 Bulk Project Actions</w:t>
+      </w:r>
+    </w:p>
+    <w:p>
+      <w:pPr>
+        <w:spacing w:after="120"/>
+      </w:pPr>
+      <w:r>
+        <w:rPr>
+          <w:rFonts w:ascii="Calibri" w:cs="Calibri" w:eastAsia="Calibri" w:hAnsi="Calibri"/>
+          <w:color w:val="1F2937"/>
+          <w:sz w:val="22"/>
+          <w:szCs w:val="22"/>
+        </w:rPr>
+        <w:t xml:space="preserve">Navigate to Admin &gt; Bulk Project Actions to perform operations across multiple projects at once.</w:t>
+      </w:r>
+    </w:p>
+    <w:p>
+      <w:pPr>
+        <w:pStyle w:val="ListParagraph"/>
+        <w:numPr>
+          <w:ilvl w:val="0"/>
+          <w:numId w:val="1"/>
+        </w:numPr>
+        <w:spacing w:after="60"/>
+      </w:pPr>
+      <w:r>
+        <w:rPr>
+          <w:rFonts w:ascii="Calibri" w:cs="Calibri" w:eastAsia="Calibri" w:hAnsi="Calibri"/>
+          <w:color w:val="1F2937"/>
+          <w:sz w:val="22"/>
+          <w:szCs w:val="22"/>
+        </w:rPr>
+        <w:t xml:space="preserve">Select projects using the checkboxes. Filter by current owner, product category, or search.</w:t>
+      </w:r>
+    </w:p>
+    <w:p>
+      <w:pPr>
+        <w:pStyle w:val="ListParagraph"/>
+        <w:numPr>
+          <w:ilvl w:val="0"/>
+          <w:numId w:val="1"/>
+        </w:numPr>
+        <w:spacing w:after="60"/>
+      </w:pPr>
+      <w:r>
+        <w:rPr>
+          <w:rFonts w:ascii="Calibri" w:cs="Calibri" w:eastAsia="Calibri" w:hAnsi="Calibri"/>
+          <w:color w:val="1F2937"/>
+          <w:sz w:val="22"/>
+          <w:szCs w:val="22"/>
+        </w:rPr>
+        <w:t xml:space="preserve">Transfer — reassign selected projects to a new owner. Optionally keep the previous owner as an editing member.</w:t>
+      </w:r>
+    </w:p>
+    <w:p>
+      <w:pPr>
+        <w:pStyle w:val="ListParagraph"/>
+        <w:numPr>
+          <w:ilvl w:val="0"/>
+          <w:numId w:val="1"/>
+        </w:numPr>
+        <w:spacing w:after="60"/>
+      </w:pPr>
+      <w:r>
+        <w:rPr>
+          <w:rFonts w:ascii="Calibri" w:cs="Calibri" w:eastAsia="Calibri" w:hAnsi="Calibri"/>
+          <w:color w:val="1F2937"/>
+          <w:sz w:val="22"/>
+          <w:szCs w:val="22"/>
+        </w:rPr>
+        <w:t xml:space="preserve">Change status — move selected projects to a new status in bulk.</w:t>
+      </w:r>
+    </w:p>
+    <w:p>
+      <w:pPr>
+        <w:pStyle w:val="ListParagraph"/>
+        <w:numPr>
+          <w:ilvl w:val="0"/>
+          <w:numId w:val="1"/>
+        </w:numPr>
+        <w:spacing w:after="60"/>
+      </w:pPr>
+      <w:r>
+        <w:rPr>
+          <w:rFonts w:ascii="Calibri" w:cs="Calibri" w:eastAsia="Calibri" w:hAnsi="Calibri"/>
+          <w:color w:val="1F2937"/>
+          <w:sz w:val="22"/>
+          <w:szCs w:val="22"/>
+        </w:rPr>
+        <w:t xml:space="preserve">Archive / delete — archive or permanently delete selected projects.</w:t>
       </w:r>
     </w:p>
     <w:p>

</xml_diff>